<commit_message>
Resume: dates + curriculum framing + cleaner monospace font
</commit_message>
<xml_diff>
--- a/public/christina-ma-product-designer-resume.docx
+++ b/public/christina-ma-product-designer-resume.docx
@@ -42,7 +42,7 @@
             </w:pPr>
             <w:r>
               <w:rPr>
-                <w:rFonts w:ascii="Courier New" w:cs="Courier New" w:eastAsia="Courier New" w:hAnsi="Courier New"/>
+                <w:rFonts w:ascii="Menlo" w:cs="Menlo" w:eastAsia="Menlo" w:hAnsi="Menlo"/>
                 <w:b/>
                 <w:bCs/>
                 <w:color w:val="000000"/>
@@ -74,10 +74,10 @@
             <w:pPr>
               <w:spacing w:after="0" w:before="0"/>
             </w:pPr>
-            <w:hyperlink w:history="1" r:id="rId9y_fn9xwlvddz8j6ylnfz">
+            <w:hyperlink w:history="1" r:id="rIdw8u5ywaudiuuuz2scdkl8">
               <w:r>
                 <w:rPr>
-                  <w:rFonts w:ascii="Courier New" w:cs="Courier New" w:eastAsia="Courier New" w:hAnsi="Courier New"/>
+                  <w:rFonts w:ascii="Menlo" w:cs="Menlo" w:eastAsia="Menlo" w:hAnsi="Menlo"/>
                   <w:color w:val="2A2A2A"/>
                   <w:sz w:val="18"/>
                   <w:szCs w:val="18"/>
@@ -87,17 +87,17 @@
             </w:hyperlink>
             <w:r>
               <w:rPr>
-                <w:rFonts w:ascii="Courier New" w:cs="Courier New" w:eastAsia="Courier New" w:hAnsi="Courier New"/>
+                <w:rFonts w:ascii="Menlo" w:cs="Menlo" w:eastAsia="Menlo" w:hAnsi="Menlo"/>
                 <w:color w:val="2A2A2A"/>
                 <w:sz w:val="18"/>
                 <w:szCs w:val="18"/>
               </w:rPr>
               <w:t xml:space="preserve">      </w:t>
             </w:r>
-            <w:hyperlink w:history="1" r:id="rIdgy9vuh6owp37319nrh34s">
+            <w:hyperlink w:history="1" r:id="rIdcjrzlqdwwipqgn7lg3es7">
               <w:r>
                 <w:rPr>
-                  <w:rFonts w:ascii="Courier New" w:cs="Courier New" w:eastAsia="Courier New" w:hAnsi="Courier New"/>
+                  <w:rFonts w:ascii="Menlo" w:cs="Menlo" w:eastAsia="Menlo" w:hAnsi="Menlo"/>
                   <w:color w:val="2A2A2A"/>
                   <w:sz w:val="18"/>
                   <w:szCs w:val="18"/>
@@ -107,7 +107,7 @@
             </w:hyperlink>
             <w:r>
               <w:rPr>
-                <w:rFonts w:ascii="Courier New" w:cs="Courier New" w:eastAsia="Courier New" w:hAnsi="Courier New"/>
+                <w:rFonts w:ascii="Menlo" w:cs="Menlo" w:eastAsia="Menlo" w:hAnsi="Menlo"/>
                 <w:color w:val="2A2A2A"/>
                 <w:sz w:val="18"/>
                 <w:szCs w:val="18"/>
@@ -141,7 +141,7 @@
             </w:pPr>
             <w:r>
               <w:rPr>
-                <w:rFonts w:ascii="Courier New" w:cs="Courier New" w:eastAsia="Courier New" w:hAnsi="Courier New"/>
+                <w:rFonts w:ascii="Menlo" w:cs="Menlo" w:eastAsia="Menlo" w:hAnsi="Menlo"/>
                 <w:color w:val="8A8A8A"/>
                 <w:sz w:val="18"/>
                 <w:szCs w:val="18"/>
@@ -173,7 +173,7 @@
             </w:pPr>
             <w:r>
               <w:rPr>
-                <w:rFonts w:ascii="Courier New" w:cs="Courier New" w:eastAsia="Courier New" w:hAnsi="Courier New"/>
+                <w:rFonts w:ascii="Menlo" w:cs="Menlo" w:eastAsia="Menlo" w:hAnsi="Menlo"/>
                 <w:color w:val="2A2A2A"/>
                 <w:sz w:val="18"/>
                 <w:szCs w:val="18"/>
@@ -207,7 +207,7 @@
             </w:pPr>
             <w:r>
               <w:rPr>
-                <w:rFonts w:ascii="Courier New" w:cs="Courier New" w:eastAsia="Courier New" w:hAnsi="Courier New"/>
+                <w:rFonts w:ascii="Menlo" w:cs="Menlo" w:eastAsia="Menlo" w:hAnsi="Menlo"/>
                 <w:color w:val="8A8A8A"/>
                 <w:sz w:val="18"/>
                 <w:szCs w:val="18"/>
@@ -239,7 +239,7 @@
             </w:pPr>
             <w:r>
               <w:rPr>
-                <w:rFonts w:ascii="Courier New" w:cs="Courier New" w:eastAsia="Courier New" w:hAnsi="Courier New"/>
+                <w:rFonts w:ascii="Menlo" w:cs="Menlo" w:eastAsia="Menlo" w:hAnsi="Menlo"/>
                 <w:b/>
                 <w:bCs/>
                 <w:color w:val="000000"/>
@@ -250,7 +250,7 @@
             </w:r>
             <w:r>
               <w:rPr>
-                <w:rFonts w:ascii="Courier New" w:cs="Courier New" w:eastAsia="Courier New" w:hAnsi="Courier New"/>
+                <w:rFonts w:ascii="Menlo" w:cs="Menlo" w:eastAsia="Menlo" w:hAnsi="Menlo"/>
                 <w:color w:val="8A8A8A"/>
                 <w:sz w:val="18"/>
                 <w:szCs w:val="18"/>
@@ -264,7 +264,7 @@
             </w:pPr>
             <w:r>
               <w:rPr>
-                <w:rFonts w:ascii="Courier New" w:cs="Courier New" w:eastAsia="Courier New" w:hAnsi="Courier New"/>
+                <w:rFonts w:ascii="Menlo" w:cs="Menlo" w:eastAsia="Menlo" w:hAnsi="Menlo"/>
                 <w:color w:val="2A2A2A"/>
                 <w:sz w:val="18"/>
                 <w:szCs w:val="18"/>
@@ -278,7 +278,7 @@
             </w:pPr>
             <w:r>
               <w:rPr>
-                <w:rFonts w:ascii="Courier New" w:cs="Courier New" w:eastAsia="Courier New" w:hAnsi="Courier New"/>
+                <w:rFonts w:ascii="Menlo" w:cs="Menlo" w:eastAsia="Menlo" w:hAnsi="Menlo"/>
                 <w:color w:val="8A8A8A"/>
                 <w:sz w:val="16"/>
                 <w:szCs w:val="16"/>
@@ -292,7 +292,7 @@
             </w:pPr>
             <w:r>
               <w:rPr>
-                <w:rFonts w:ascii="Courier New" w:cs="Courier New" w:eastAsia="Courier New" w:hAnsi="Courier New"/>
+                <w:rFonts w:ascii="Menlo" w:cs="Menlo" w:eastAsia="Menlo" w:hAnsi="Menlo"/>
                 <w:b/>
                 <w:bCs/>
                 <w:color w:val="000000"/>
@@ -303,7 +303,7 @@
             </w:r>
             <w:r>
               <w:rPr>
-                <w:rFonts w:ascii="Courier New" w:cs="Courier New" w:eastAsia="Courier New" w:hAnsi="Courier New"/>
+                <w:rFonts w:ascii="Menlo" w:cs="Menlo" w:eastAsia="Menlo" w:hAnsi="Menlo"/>
                 <w:color w:val="8A8A8A"/>
                 <w:sz w:val="18"/>
                 <w:szCs w:val="18"/>
@@ -317,7 +317,7 @@
             </w:pPr>
             <w:r>
               <w:rPr>
-                <w:rFonts w:ascii="Courier New" w:cs="Courier New" w:eastAsia="Courier New" w:hAnsi="Courier New"/>
+                <w:rFonts w:ascii="Menlo" w:cs="Menlo" w:eastAsia="Menlo" w:hAnsi="Menlo"/>
                 <w:color w:val="2A2A2A"/>
                 <w:sz w:val="18"/>
                 <w:szCs w:val="18"/>
@@ -331,12 +331,12 @@
             </w:pPr>
             <w:r>
               <w:rPr>
-                <w:rFonts w:ascii="Courier New" w:cs="Courier New" w:eastAsia="Courier New" w:hAnsi="Courier New"/>
+                <w:rFonts w:ascii="Menlo" w:cs="Menlo" w:eastAsia="Menlo" w:hAnsi="Menlo"/>
                 <w:color w:val="8A8A8A"/>
                 <w:sz w:val="16"/>
                 <w:szCs w:val="16"/>
               </w:rPr>
-              <w:t xml:space="preserve">Shipped 2025 — App Store</w:t>
+              <w:t xml:space="preserve">Shipped 2026 — App Store</w:t>
             </w:r>
           </w:p>
           <w:p>
@@ -345,7 +345,7 @@
             </w:pPr>
             <w:r>
               <w:rPr>
-                <w:rFonts w:ascii="Courier New" w:cs="Courier New" w:eastAsia="Courier New" w:hAnsi="Courier New"/>
+                <w:rFonts w:ascii="Menlo" w:cs="Menlo" w:eastAsia="Menlo" w:hAnsi="Menlo"/>
                 <w:b/>
                 <w:bCs/>
                 <w:color w:val="000000"/>
@@ -356,7 +356,7 @@
             </w:r>
             <w:r>
               <w:rPr>
-                <w:rFonts w:ascii="Courier New" w:cs="Courier New" w:eastAsia="Courier New" w:hAnsi="Courier New"/>
+                <w:rFonts w:ascii="Menlo" w:cs="Menlo" w:eastAsia="Menlo" w:hAnsi="Menlo"/>
                 <w:color w:val="8A8A8A"/>
                 <w:sz w:val="18"/>
                 <w:szCs w:val="18"/>
@@ -370,7 +370,7 @@
             </w:pPr>
             <w:r>
               <w:rPr>
-                <w:rFonts w:ascii="Courier New" w:cs="Courier New" w:eastAsia="Courier New" w:hAnsi="Courier New"/>
+                <w:rFonts w:ascii="Menlo" w:cs="Menlo" w:eastAsia="Menlo" w:hAnsi="Menlo"/>
                 <w:color w:val="2A2A2A"/>
                 <w:sz w:val="18"/>
                 <w:szCs w:val="18"/>
@@ -384,7 +384,7 @@
             </w:pPr>
             <w:r>
               <w:rPr>
-                <w:rFonts w:ascii="Courier New" w:cs="Courier New" w:eastAsia="Courier New" w:hAnsi="Courier New"/>
+                <w:rFonts w:ascii="Menlo" w:cs="Menlo" w:eastAsia="Menlo" w:hAnsi="Menlo"/>
                 <w:color w:val="8A8A8A"/>
                 <w:sz w:val="16"/>
                 <w:szCs w:val="16"/>
@@ -398,7 +398,7 @@
             </w:pPr>
             <w:r>
               <w:rPr>
-                <w:rFonts w:ascii="Courier New" w:cs="Courier New" w:eastAsia="Courier New" w:hAnsi="Courier New"/>
+                <w:rFonts w:ascii="Menlo" w:cs="Menlo" w:eastAsia="Menlo" w:hAnsi="Menlo"/>
                 <w:b/>
                 <w:bCs/>
                 <w:color w:val="000000"/>
@@ -409,7 +409,7 @@
             </w:r>
             <w:r>
               <w:rPr>
-                <w:rFonts w:ascii="Courier New" w:cs="Courier New" w:eastAsia="Courier New" w:hAnsi="Courier New"/>
+                <w:rFonts w:ascii="Menlo" w:cs="Menlo" w:eastAsia="Menlo" w:hAnsi="Menlo"/>
                 <w:color w:val="8A8A8A"/>
                 <w:sz w:val="18"/>
                 <w:szCs w:val="18"/>
@@ -423,7 +423,7 @@
             </w:pPr>
             <w:r>
               <w:rPr>
-                <w:rFonts w:ascii="Courier New" w:cs="Courier New" w:eastAsia="Courier New" w:hAnsi="Courier New"/>
+                <w:rFonts w:ascii="Menlo" w:cs="Menlo" w:eastAsia="Menlo" w:hAnsi="Menlo"/>
                 <w:color w:val="2A2A2A"/>
                 <w:sz w:val="18"/>
                 <w:szCs w:val="18"/>
@@ -437,12 +437,12 @@
             </w:pPr>
             <w:r>
               <w:rPr>
-                <w:rFonts w:ascii="Courier New" w:cs="Courier New" w:eastAsia="Courier New" w:hAnsi="Courier New"/>
+                <w:rFonts w:ascii="Menlo" w:cs="Menlo" w:eastAsia="Menlo" w:hAnsi="Menlo"/>
                 <w:color w:val="8A8A8A"/>
                 <w:sz w:val="16"/>
                 <w:szCs w:val="16"/>
               </w:rPr>
-              <w:t xml:space="preserve">2024 to 2025</w:t>
+              <w:t xml:space="preserve">2025</w:t>
             </w:r>
           </w:p>
         </w:tc>
@@ -471,7 +471,7 @@
             </w:pPr>
             <w:r>
               <w:rPr>
-                <w:rFonts w:ascii="Courier New" w:cs="Courier New" w:eastAsia="Courier New" w:hAnsi="Courier New"/>
+                <w:rFonts w:ascii="Menlo" w:cs="Menlo" w:eastAsia="Menlo" w:hAnsi="Menlo"/>
                 <w:color w:val="8A8A8A"/>
                 <w:sz w:val="18"/>
                 <w:szCs w:val="18"/>
@@ -503,7 +503,7 @@
             </w:pPr>
             <w:r>
               <w:rPr>
-                <w:rFonts w:ascii="Courier New" w:cs="Courier New" w:eastAsia="Courier New" w:hAnsi="Courier New"/>
+                <w:rFonts w:ascii="Menlo" w:cs="Menlo" w:eastAsia="Menlo" w:hAnsi="Menlo"/>
                 <w:b/>
                 <w:bCs/>
                 <w:color w:val="000000"/>
@@ -514,7 +514,7 @@
             </w:r>
             <w:r>
               <w:rPr>
-                <w:rFonts w:ascii="Courier New" w:cs="Courier New" w:eastAsia="Courier New" w:hAnsi="Courier New"/>
+                <w:rFonts w:ascii="Menlo" w:cs="Menlo" w:eastAsia="Menlo" w:hAnsi="Menlo"/>
                 <w:color w:val="8A8A8A"/>
                 <w:sz w:val="18"/>
                 <w:szCs w:val="18"/>
@@ -528,21 +528,21 @@
             </w:pPr>
             <w:r>
               <w:rPr>
-                <w:rFonts w:ascii="Courier New" w:cs="Courier New" w:eastAsia="Courier New" w:hAnsi="Courier New"/>
+                <w:rFonts w:ascii="Menlo" w:cs="Menlo" w:eastAsia="Menlo" w:hAnsi="Menlo"/>
                 <w:color w:val="2A2A2A"/>
                 <w:sz w:val="18"/>
                 <w:szCs w:val="18"/>
               </w:rPr>
-              <w:t xml:space="preserve">Observe how 5–6-year-olds interact with new tools and interfaces daily — direct insight into first-time user behavior.</w:t>
-            </w:r>
-          </w:p>
-          <w:p>
-            <w:pPr>
-              <w:spacing w:after="0" w:before="0"/>
-            </w:pPr>
-            <w:r>
-              <w:rPr>
-                <w:rFonts w:ascii="Courier New" w:cs="Courier New" w:eastAsia="Courier New" w:hAnsi="Courier New"/>
+              <w:t xml:space="preserve">Design curriculum, assessments, worksheets, and homework for 5–6-year-olds, then observe daily how they interact with the materials — direct insight into first-time user behavior.</w:t>
+            </w:r>
+          </w:p>
+          <w:p>
+            <w:pPr>
+              <w:spacing w:after="0" w:before="0"/>
+            </w:pPr>
+            <w:r>
+              <w:rPr>
+                <w:rFonts w:ascii="Menlo" w:cs="Menlo" w:eastAsia="Menlo" w:hAnsi="Menlo"/>
                 <w:color w:val="8A8A8A"/>
                 <w:sz w:val="16"/>
                 <w:szCs w:val="16"/>
@@ -556,7 +556,7 @@
             </w:pPr>
             <w:r>
               <w:rPr>
-                <w:rFonts w:ascii="Courier New" w:cs="Courier New" w:eastAsia="Courier New" w:hAnsi="Courier New"/>
+                <w:rFonts w:ascii="Menlo" w:cs="Menlo" w:eastAsia="Menlo" w:hAnsi="Menlo"/>
                 <w:b/>
                 <w:bCs/>
                 <w:color w:val="000000"/>
@@ -567,7 +567,7 @@
             </w:r>
             <w:r>
               <w:rPr>
-                <w:rFonts w:ascii="Courier New" w:cs="Courier New" w:eastAsia="Courier New" w:hAnsi="Courier New"/>
+                <w:rFonts w:ascii="Menlo" w:cs="Menlo" w:eastAsia="Menlo" w:hAnsi="Menlo"/>
                 <w:color w:val="8A8A8A"/>
                 <w:sz w:val="18"/>
                 <w:szCs w:val="18"/>
@@ -581,7 +581,7 @@
             </w:pPr>
             <w:r>
               <w:rPr>
-                <w:rFonts w:ascii="Courier New" w:cs="Courier New" w:eastAsia="Courier New" w:hAnsi="Courier New"/>
+                <w:rFonts w:ascii="Menlo" w:cs="Menlo" w:eastAsia="Menlo" w:hAnsi="Menlo"/>
                 <w:color w:val="2A2A2A"/>
                 <w:sz w:val="18"/>
                 <w:szCs w:val="18"/>
@@ -595,7 +595,7 @@
             </w:pPr>
             <w:r>
               <w:rPr>
-                <w:rFonts w:ascii="Courier New" w:cs="Courier New" w:eastAsia="Courier New" w:hAnsi="Courier New"/>
+                <w:rFonts w:ascii="Menlo" w:cs="Menlo" w:eastAsia="Menlo" w:hAnsi="Menlo"/>
                 <w:color w:val="8A8A8A"/>
                 <w:sz w:val="16"/>
                 <w:szCs w:val="16"/>
@@ -609,7 +609,7 @@
             </w:pPr>
             <w:r>
               <w:rPr>
-                <w:rFonts w:ascii="Courier New" w:cs="Courier New" w:eastAsia="Courier New" w:hAnsi="Courier New"/>
+                <w:rFonts w:ascii="Menlo" w:cs="Menlo" w:eastAsia="Menlo" w:hAnsi="Menlo"/>
                 <w:b/>
                 <w:bCs/>
                 <w:color w:val="000000"/>
@@ -620,7 +620,7 @@
             </w:r>
             <w:r>
               <w:rPr>
-                <w:rFonts w:ascii="Courier New" w:cs="Courier New" w:eastAsia="Courier New" w:hAnsi="Courier New"/>
+                <w:rFonts w:ascii="Menlo" w:cs="Menlo" w:eastAsia="Menlo" w:hAnsi="Menlo"/>
                 <w:color w:val="8A8A8A"/>
                 <w:sz w:val="18"/>
                 <w:szCs w:val="18"/>
@@ -634,7 +634,7 @@
             </w:pPr>
             <w:r>
               <w:rPr>
-                <w:rFonts w:ascii="Courier New" w:cs="Courier New" w:eastAsia="Courier New" w:hAnsi="Courier New"/>
+                <w:rFonts w:ascii="Menlo" w:cs="Menlo" w:eastAsia="Menlo" w:hAnsi="Menlo"/>
                 <w:color w:val="2A2A2A"/>
                 <w:sz w:val="18"/>
                 <w:szCs w:val="18"/>
@@ -648,7 +648,7 @@
             </w:pPr>
             <w:r>
               <w:rPr>
-                <w:rFonts w:ascii="Courier New" w:cs="Courier New" w:eastAsia="Courier New" w:hAnsi="Courier New"/>
+                <w:rFonts w:ascii="Menlo" w:cs="Menlo" w:eastAsia="Menlo" w:hAnsi="Menlo"/>
                 <w:color w:val="8A8A8A"/>
                 <w:sz w:val="16"/>
                 <w:szCs w:val="16"/>
@@ -682,7 +682,7 @@
             </w:pPr>
             <w:r>
               <w:rPr>
-                <w:rFonts w:ascii="Courier New" w:cs="Courier New" w:eastAsia="Courier New" w:hAnsi="Courier New"/>
+                <w:rFonts w:ascii="Menlo" w:cs="Menlo" w:eastAsia="Menlo" w:hAnsi="Menlo"/>
                 <w:color w:val="8A8A8A"/>
                 <w:sz w:val="18"/>
                 <w:szCs w:val="18"/>
@@ -714,7 +714,7 @@
             </w:pPr>
             <w:r>
               <w:rPr>
-                <w:rFonts w:ascii="Courier New" w:cs="Courier New" w:eastAsia="Courier New" w:hAnsi="Courier New"/>
+                <w:rFonts w:ascii="Menlo" w:cs="Menlo" w:eastAsia="Menlo" w:hAnsi="Menlo"/>
                 <w:b/>
                 <w:bCs/>
                 <w:color w:val="000000"/>
@@ -725,7 +725,7 @@
             </w:r>
             <w:r>
               <w:rPr>
-                <w:rFonts w:ascii="Courier New" w:cs="Courier New" w:eastAsia="Courier New" w:hAnsi="Courier New"/>
+                <w:rFonts w:ascii="Menlo" w:cs="Menlo" w:eastAsia="Menlo" w:hAnsi="Menlo"/>
                 <w:color w:val="8A8A8A"/>
                 <w:sz w:val="18"/>
                 <w:szCs w:val="18"/>
@@ -734,7 +734,7 @@
             </w:r>
             <w:r>
               <w:rPr>
-                <w:rFonts w:ascii="Courier New" w:cs="Courier New" w:eastAsia="Courier New" w:hAnsi="Courier New"/>
+                <w:rFonts w:ascii="Menlo" w:cs="Menlo" w:eastAsia="Menlo" w:hAnsi="Menlo"/>
                 <w:color w:val="8A8A8A"/>
                 <w:sz w:val="16"/>
                 <w:szCs w:val="16"/>
@@ -748,7 +748,7 @@
             </w:pPr>
             <w:r>
               <w:rPr>
-                <w:rFonts w:ascii="Courier New" w:cs="Courier New" w:eastAsia="Courier New" w:hAnsi="Courier New"/>
+                <w:rFonts w:ascii="Menlo" w:cs="Menlo" w:eastAsia="Menlo" w:hAnsi="Menlo"/>
                 <w:b/>
                 <w:bCs/>
                 <w:color w:val="000000"/>
@@ -759,7 +759,7 @@
             </w:r>
             <w:r>
               <w:rPr>
-                <w:rFonts w:ascii="Courier New" w:cs="Courier New" w:eastAsia="Courier New" w:hAnsi="Courier New"/>
+                <w:rFonts w:ascii="Menlo" w:cs="Menlo" w:eastAsia="Menlo" w:hAnsi="Menlo"/>
                 <w:color w:val="8A8A8A"/>
                 <w:sz w:val="18"/>
                 <w:szCs w:val="18"/>
@@ -768,7 +768,7 @@
             </w:r>
             <w:r>
               <w:rPr>
-                <w:rFonts w:ascii="Courier New" w:cs="Courier New" w:eastAsia="Courier New" w:hAnsi="Courier New"/>
+                <w:rFonts w:ascii="Menlo" w:cs="Menlo" w:eastAsia="Menlo" w:hAnsi="Menlo"/>
                 <w:color w:val="8A8A8A"/>
                 <w:sz w:val="16"/>
                 <w:szCs w:val="16"/>
@@ -789,7 +789,7 @@
               <w:right w:val="none" w:color="FFFFFF" w:sz="0"/>
             </w:tcBorders>
             <w:tcMar>
-              <w:top w:type="dxa" w:w="120"/>
+              <w:top w:type="dxa" w:w="60"/>
               <w:left w:type="dxa" w:w="0"/>
               <w:bottom w:type="dxa" w:w="60"/>
               <w:right w:type="dxa" w:w="0"/>
@@ -802,7 +802,7 @@
             </w:pPr>
             <w:r>
               <w:rPr>
-                <w:rFonts w:ascii="Courier New" w:cs="Courier New" w:eastAsia="Courier New" w:hAnsi="Courier New"/>
+                <w:rFonts w:ascii="Menlo" w:cs="Menlo" w:eastAsia="Menlo" w:hAnsi="Menlo"/>
                 <w:color w:val="8A8A8A"/>
                 <w:sz w:val="18"/>
                 <w:szCs w:val="18"/>
@@ -821,7 +821,7 @@
               <w:right w:val="none" w:color="FFFFFF" w:sz="0"/>
             </w:tcBorders>
             <w:tcMar>
-              <w:top w:type="dxa" w:w="120"/>
+              <w:top w:type="dxa" w:w="60"/>
               <w:left w:type="dxa" w:w="0"/>
               <w:bottom w:type="dxa" w:w="60"/>
               <w:right w:type="dxa" w:w="0"/>
@@ -834,7 +834,7 @@
             </w:pPr>
             <w:r>
               <w:rPr>
-                <w:rFonts w:ascii="Courier New" w:cs="Courier New" w:eastAsia="Courier New" w:hAnsi="Courier New"/>
+                <w:rFonts w:ascii="Menlo" w:cs="Menlo" w:eastAsia="Menlo" w:hAnsi="Menlo"/>
                 <w:b/>
                 <w:bCs/>
                 <w:color w:val="000000"/>
@@ -845,7 +845,7 @@
             </w:r>
             <w:r>
               <w:rPr>
-                <w:rFonts w:ascii="Courier New" w:cs="Courier New" w:eastAsia="Courier New" w:hAnsi="Courier New"/>
+                <w:rFonts w:ascii="Menlo" w:cs="Menlo" w:eastAsia="Menlo" w:hAnsi="Menlo"/>
                 <w:color w:val="2A2A2A"/>
                 <w:sz w:val="18"/>
                 <w:szCs w:val="18"/>
@@ -859,7 +859,7 @@
             </w:pPr>
             <w:r>
               <w:rPr>
-                <w:rFonts w:ascii="Courier New" w:cs="Courier New" w:eastAsia="Courier New" w:hAnsi="Courier New"/>
+                <w:rFonts w:ascii="Menlo" w:cs="Menlo" w:eastAsia="Menlo" w:hAnsi="Menlo"/>
                 <w:b/>
                 <w:bCs/>
                 <w:color w:val="000000"/>
@@ -870,7 +870,7 @@
             </w:r>
             <w:r>
               <w:rPr>
-                <w:rFonts w:ascii="Courier New" w:cs="Courier New" w:eastAsia="Courier New" w:hAnsi="Courier New"/>
+                <w:rFonts w:ascii="Menlo" w:cs="Menlo" w:eastAsia="Menlo" w:hAnsi="Menlo"/>
                 <w:color w:val="2A2A2A"/>
                 <w:sz w:val="18"/>
                 <w:szCs w:val="18"/>
@@ -883,7 +883,7 @@
     </w:tbl>
     <w:sectPr>
       <w:pgSz w:w="12240" w:h="15840" w:orient="portrait"/>
-      <w:pgMar w:top="720" w:right="1440" w:bottom="720" w:left="1440" w:header="708" w:footer="708" w:gutter="0"/>
+      <w:pgMar w:top="540" w:right="1440" w:bottom="540" w:left="1440" w:header="708" w:footer="708" w:gutter="0"/>
       <w:pgNumType/>
       <w:docGrid w:linePitch="360"/>
     </w:sectPr>
@@ -1069,7 +1069,7 @@
   <w:docDefaults>
     <w:rPrDefault>
       <w:rPr>
-        <w:rFonts w:ascii="Courier New" w:cs="Courier New" w:eastAsia="Courier New" w:hAnsi="Courier New"/>
+        <w:rFonts w:ascii="Menlo" w:cs="Menlo" w:eastAsia="Menlo" w:hAnsi="Menlo"/>
         <w:sz w:val="18"/>
         <w:szCs w:val="18"/>
       </w:rPr>

</xml_diff>

<commit_message>
Resume: new summary + cleaner monospace + synced project dates
</commit_message>
<xml_diff>
--- a/public/christina-ma-product-designer-resume.docx
+++ b/public/christina-ma-product-designer-resume.docx
@@ -74,7 +74,7 @@
             <w:pPr>
               <w:spacing w:after="0" w:before="0"/>
             </w:pPr>
-            <w:hyperlink w:history="1" r:id="rIdw8u5ywaudiuuuz2scdkl8">
+            <w:hyperlink w:history="1" r:id="rIdasv4mauwcfdh9qostb0hc">
               <w:r>
                 <w:rPr>
                   <w:rFonts w:ascii="Menlo" w:cs="Menlo" w:eastAsia="Menlo" w:hAnsi="Menlo"/>
@@ -94,7 +94,7 @@
               </w:rPr>
               <w:t xml:space="preserve">      </w:t>
             </w:r>
-            <w:hyperlink w:history="1" r:id="rIdcjrzlqdwwipqgn7lg3es7">
+            <w:hyperlink w:history="1" r:id="rIdefnyyqr8awjbqjn95i6e3">
               <w:r>
                 <w:rPr>
                   <w:rFonts w:ascii="Menlo" w:cs="Menlo" w:eastAsia="Menlo" w:hAnsi="Menlo"/>
@@ -178,7 +178,7 @@
                 <w:sz w:val="18"/>
                 <w:szCs w:val="18"/>
               </w:rPr>
-              <w:t xml:space="preserve">Product designer with 8+ years of experience observing how first-time users interact with products. I teach kindergarten full-time, which means I watch five-year-olds navigate new interfaces every day — and I bring that perspective to everything I design. I’ve shipped two apps to the App Store end-to-end — design, build, and launch — and I’m fluent in English and Mandarin.</w:t>
+              <w:t xml:space="preserve">Product designer and educator focused on first-time user behavior, onboarding, and intuitive interaction design. I’ve shipped two App Store apps end-to-end and bring a strong understanding of user psychology, engagement, and accessibility from years of classroom observation. I’m fluent in English and Mandarin.</w:t>
             </w:r>
           </w:p>
         </w:tc>

</xml_diff>

<commit_message>
Reorder resume projects (ABC Countdown last), strengthen summary, remove dashes
</commit_message>
<xml_diff>
--- a/public/christina-ma-product-designer-resume.docx
+++ b/public/christina-ma-product-designer-resume.docx
@@ -178,7 +178,7 @@
                 <w:sz w:val="18"/>
                 <w:szCs w:val="18"/>
               </w:rPr>
-              <w:t xml:space="preserve">Product designer and educator focused on first-time user behavior, onboarding, and intuitive interaction design. I’ve shipped two App Store apps end-to-end and bring a strong understanding of user psychology, engagement, and accessibility from years of classroom observation. I’m fluent in English and Mandarin.</w:t>
+              <w:t xml:space="preserve">Product designer and educator who has taught hundreds of young children, so I design user flows intuitive enough for a five-year-old to follow on the first try. I’ve spent years watching real users meet new tools for the first time, which is the core of how I approach onboarding, first-time user behavior, and interaction design. I’ve shipped two App Store apps end-to-end and bring a deep understanding of user psychology, engagement, and accessibility. Fluent in English and Mandarin.</w:t>
             </w:r>
           </w:p>
         </w:tc>
@@ -246,16 +246,16 @@
                 <w:sz w:val="18"/>
                 <w:szCs w:val="18"/>
               </w:rPr>
-              <w:t xml:space="preserve">ABC Countdown</w:t>
-            </w:r>
-            <w:r>
-              <w:rPr>
-                <w:rFonts w:ascii="Menlo" w:cs="Menlo" w:eastAsia="Menlo" w:hAnsi="Menlo"/>
-                <w:color w:val="8A8A8A"/>
-                <w:sz w:val="18"/>
-                <w:szCs w:val="18"/>
-              </w:rPr>
-              <w:t xml:space="preserve">  3D Nostalgia Game</w:t>
+              <w:t xml:space="preserve">Little Checks</w:t>
+            </w:r>
+            <w:r>
+              <w:rPr>
+                <w:rFonts w:ascii="Menlo" w:cs="Menlo" w:eastAsia="Menlo" w:hAnsi="Menlo"/>
+                <w:color w:val="8A8A8A"/>
+                <w:sz w:val="18"/>
+                <w:szCs w:val="18"/>
+              </w:rPr>
+              <w:t xml:space="preserve">  Habit Tracking App</w:t>
             </w:r>
           </w:p>
           <w:p>
@@ -269,7 +269,7 @@
                 <w:sz w:val="18"/>
                 <w:szCs w:val="18"/>
               </w:rPr>
-              <w:t xml:space="preserve">A 3D game where adults relive the wonder of being a kindergartener — each letter of the ABC countdown is a mini-game. Building in Unity with Blender for 3D modeling and AI coding tools for development.</w:t>
+              <w:t xml:space="preserve">Designed and built end-to-end in SwiftUI, from concept to App Store launch. Based on the behavior charts I use with my kindergartners, I adapted a proven classroom model into a consumer product. Includes Mandarin localization.</w:t>
             </w:r>
           </w:p>
           <w:p>
@@ -283,7 +283,7 @@
                 <w:sz w:val="16"/>
                 <w:szCs w:val="16"/>
               </w:rPr>
-              <w:t xml:space="preserve">In progress — 2026</w:t>
+              <w:t xml:space="preserve">Shipped 2026 · App Store</w:t>
             </w:r>
           </w:p>
           <w:p>
@@ -299,16 +299,16 @@
                 <w:sz w:val="18"/>
                 <w:szCs w:val="18"/>
               </w:rPr>
-              <w:t xml:space="preserve">Little Checks</w:t>
-            </w:r>
-            <w:r>
-              <w:rPr>
-                <w:rFonts w:ascii="Menlo" w:cs="Menlo" w:eastAsia="Menlo" w:hAnsi="Menlo"/>
-                <w:color w:val="8A8A8A"/>
-                <w:sz w:val="18"/>
-                <w:szCs w:val="18"/>
-              </w:rPr>
-              <w:t xml:space="preserve">  Habit Tracking App</w:t>
+              <w:t xml:space="preserve">Dear Traveler</w:t>
+            </w:r>
+            <w:r>
+              <w:rPr>
+                <w:rFonts w:ascii="Menlo" w:cs="Menlo" w:eastAsia="Menlo" w:hAnsi="Menlo"/>
+                <w:color w:val="8A8A8A"/>
+                <w:sz w:val="18"/>
+                <w:szCs w:val="18"/>
+              </w:rPr>
+              <w:t xml:space="preserve">  Interactive Story Game</w:t>
             </w:r>
           </w:p>
           <w:p>
@@ -322,7 +322,7 @@
                 <w:sz w:val="18"/>
                 <w:szCs w:val="18"/>
               </w:rPr>
-              <w:t xml:space="preserve">Designed and built end-to-end in SwiftUI, from concept to App Store launch. Based on the behavior charts I use with my kindergartners, I adapted a proven classroom model into a consumer product. Includes Mandarin localization.</w:t>
+              <w:t xml:space="preserve">An interactive diary game inspired by Tom Riddle’s diary and Lifeline. I wrote the full branching narrative, composed background music, and designed every screen.</w:t>
             </w:r>
           </w:p>
           <w:p>
@@ -336,7 +336,7 @@
                 <w:sz w:val="16"/>
                 <w:szCs w:val="16"/>
               </w:rPr>
-              <w:t xml:space="preserve">Shipped 2026 — App Store</w:t>
+              <w:t xml:space="preserve">Shipped 2025 · App Store</w:t>
             </w:r>
           </w:p>
           <w:p>
@@ -352,16 +352,16 @@
                 <w:sz w:val="18"/>
                 <w:szCs w:val="18"/>
               </w:rPr>
-              <w:t xml:space="preserve">Dear Traveler</w:t>
-            </w:r>
-            <w:r>
-              <w:rPr>
-                <w:rFonts w:ascii="Menlo" w:cs="Menlo" w:eastAsia="Menlo" w:hAnsi="Menlo"/>
-                <w:color w:val="8A8A8A"/>
-                <w:sz w:val="18"/>
-                <w:szCs w:val="18"/>
-              </w:rPr>
-              <w:t xml:space="preserve">  Interactive Story Game</w:t>
+              <w:t xml:space="preserve">Student Testing Platform</w:t>
+            </w:r>
+            <w:r>
+              <w:rPr>
+                <w:rFonts w:ascii="Menlo" w:cs="Menlo" w:eastAsia="Menlo" w:hAnsi="Menlo"/>
+                <w:color w:val="8A8A8A"/>
+                <w:sz w:val="18"/>
+                <w:szCs w:val="18"/>
+              </w:rPr>
+              <w:t xml:space="preserve">  UX Research Case Study</w:t>
             </w:r>
           </w:p>
           <w:p>
@@ -375,7 +375,7 @@
                 <w:sz w:val="18"/>
                 <w:szCs w:val="18"/>
               </w:rPr>
-              <w:t xml:space="preserve">An interactive diary game inspired by Tom Riddle’s diary and Lifeline. I wrote the full branching narrative, composed background music, and designed every screen.</w:t>
+              <w:t xml:space="preserve">Observed hundreds of kindergarten and elementary students taking standardized tests, documenting 10 distinct steps and pain points. Redesigned the experience in Figma with reduced cognitive load and clearer navigation.</w:t>
             </w:r>
           </w:p>
           <w:p>
@@ -389,7 +389,7 @@
                 <w:sz w:val="16"/>
                 <w:szCs w:val="16"/>
               </w:rPr>
-              <w:t xml:space="preserve">Shipped 2025 — App Store</w:t>
+              <w:t xml:space="preserve">2025</w:t>
             </w:r>
           </w:p>
           <w:p>
@@ -405,16 +405,16 @@
                 <w:sz w:val="18"/>
                 <w:szCs w:val="18"/>
               </w:rPr>
-              <w:t xml:space="preserve">Student Testing Platform</w:t>
-            </w:r>
-            <w:r>
-              <w:rPr>
-                <w:rFonts w:ascii="Menlo" w:cs="Menlo" w:eastAsia="Menlo" w:hAnsi="Menlo"/>
-                <w:color w:val="8A8A8A"/>
-                <w:sz w:val="18"/>
-                <w:szCs w:val="18"/>
-              </w:rPr>
-              <w:t xml:space="preserve">  UX Research Case Study</w:t>
+              <w:t xml:space="preserve">ABC Countdown</w:t>
+            </w:r>
+            <w:r>
+              <w:rPr>
+                <w:rFonts w:ascii="Menlo" w:cs="Menlo" w:eastAsia="Menlo" w:hAnsi="Menlo"/>
+                <w:color w:val="8A8A8A"/>
+                <w:sz w:val="18"/>
+                <w:szCs w:val="18"/>
+              </w:rPr>
+              <w:t xml:space="preserve">  3D Nostalgia Game</w:t>
             </w:r>
           </w:p>
           <w:p>
@@ -428,7 +428,7 @@
                 <w:sz w:val="18"/>
                 <w:szCs w:val="18"/>
               </w:rPr>
-              <w:t xml:space="preserve">Observed hundreds of kindergarten and elementary students taking standardized tests, documenting 10 distinct steps and pain points. Redesigned the experience in Figma with reduced cognitive load and clearer navigation.</w:t>
+              <w:t xml:space="preserve">Designing a 3D game where adults relive the wonder of being a kindergartener. Each letter of the ABC countdown is its own mini-game. Building in Unity with Blender for 3D modeling and AI coding tools.</w:t>
             </w:r>
           </w:p>
           <w:p>
@@ -442,7 +442,7 @@
                 <w:sz w:val="16"/>
                 <w:szCs w:val="16"/>
               </w:rPr>
-              <w:t xml:space="preserve">2025</w:t>
+              <w:t xml:space="preserve">In progress · 2026</w:t>
             </w:r>
           </w:p>
         </w:tc>
@@ -533,7 +533,7 @@
                 <w:sz w:val="18"/>
                 <w:szCs w:val="18"/>
               </w:rPr>
-              <w:t xml:space="preserve">Design curriculum, assessments, worksheets, and homework for 5–6-year-olds, then observe daily how they interact with the materials — direct insight into first-time user behavior.</w:t>
+              <w:t xml:space="preserve">Design curriculum, assessments, worksheets, and homework for 5 to 6-year-olds, then observe daily how they interact with the materials, giving direct insight into first-time user behavior.</w:t>
             </w:r>
           </w:p>
           <w:p>
@@ -547,7 +547,7 @@
                 <w:sz w:val="16"/>
                 <w:szCs w:val="16"/>
               </w:rPr>
-              <w:t xml:space="preserve">Aug 2023 to Present — Irvine, CA</w:t>
+              <w:t xml:space="preserve">Aug 2023 to Present · Irvine, CA</w:t>
             </w:r>
           </w:p>
           <w:p>
@@ -586,7 +586,7 @@
                 <w:sz w:val="18"/>
                 <w:szCs w:val="18"/>
               </w:rPr>
-              <w:t xml:space="preserve">Designed and taught two undergraduate writing courses from scratch — business writing and biology writing. Built the full curriculum, lesson plans, and assignments around clear, structured communication.</w:t>
+              <w:t xml:space="preserve">Designed and taught two undergraduate writing courses from scratch: business writing and biology writing. Built the full curriculum, lesson plans, and assignments around clear, structured communication.</w:t>
             </w:r>
           </w:p>
           <w:p>
@@ -600,7 +600,7 @@
                 <w:sz w:val="16"/>
                 <w:szCs w:val="16"/>
               </w:rPr>
-              <w:t xml:space="preserve">Sep 2022 to Jun 2023 — Seattle, WA</w:t>
+              <w:t xml:space="preserve">Sep 2022 to Jun 2023 · Seattle, WA</w:t>
             </w:r>
           </w:p>
           <w:p>
@@ -653,7 +653,7 @@
                 <w:sz w:val="16"/>
                 <w:szCs w:val="16"/>
               </w:rPr>
-              <w:t xml:space="preserve">Aug 2018 to Jun 2021 — South Jordan, UT</w:t>
+              <w:t xml:space="preserve">Aug 2018 to Jun 2021 · South Jordan, UT</w:t>
             </w:r>
           </w:p>
         </w:tc>
@@ -739,7 +739,7 @@
                 <w:sz w:val="16"/>
                 <w:szCs w:val="16"/>
               </w:rPr>
-              <w:t xml:space="preserve">2021 to 2023 — Seattle, WA</w:t>
+              <w:t xml:space="preserve">2021 to 2023 · Seattle, WA</w:t>
             </w:r>
           </w:p>
           <w:p>
@@ -773,7 +773,7 @@
                 <w:sz w:val="16"/>
                 <w:szCs w:val="16"/>
               </w:rPr>
-              <w:t xml:space="preserve">2013 to 2018 — Provo, UT</w:t>
+              <w:t xml:space="preserve">2013 to 2018 · Provo, UT</w:t>
             </w:r>
           </w:p>
         </w:tc>

</xml_diff>

<commit_message>
Resume PDF in readable proportional serif, one page
</commit_message>
<xml_diff>
--- a/public/christina-ma-product-designer-resume.docx
+++ b/public/christina-ma-product-designer-resume.docx
@@ -42,7 +42,7 @@
             </w:pPr>
             <w:r>
               <w:rPr>
-                <w:rFonts w:ascii="Menlo" w:cs="Menlo" w:eastAsia="Menlo" w:hAnsi="Menlo"/>
+                <w:rFonts w:ascii="Georgia" w:cs="Georgia" w:eastAsia="Georgia" w:hAnsi="Georgia"/>
                 <w:b/>
                 <w:bCs/>
                 <w:color w:val="000000"/>
@@ -77,7 +77,7 @@
             <w:hyperlink w:history="1" r:id="rIdasv4mauwcfdh9qostb0hc">
               <w:r>
                 <w:rPr>
-                  <w:rFonts w:ascii="Menlo" w:cs="Menlo" w:eastAsia="Menlo" w:hAnsi="Menlo"/>
+                  <w:rFonts w:ascii="Georgia" w:cs="Georgia" w:eastAsia="Georgia" w:hAnsi="Georgia"/>
                   <w:color w:val="2A2A2A"/>
                   <w:sz w:val="18"/>
                   <w:szCs w:val="18"/>
@@ -87,7 +87,7 @@
             </w:hyperlink>
             <w:r>
               <w:rPr>
-                <w:rFonts w:ascii="Menlo" w:cs="Menlo" w:eastAsia="Menlo" w:hAnsi="Menlo"/>
+                <w:rFonts w:ascii="Georgia" w:cs="Georgia" w:eastAsia="Georgia" w:hAnsi="Georgia"/>
                 <w:color w:val="2A2A2A"/>
                 <w:sz w:val="18"/>
                 <w:szCs w:val="18"/>
@@ -97,7 +97,7 @@
             <w:hyperlink w:history="1" r:id="rIdefnyyqr8awjbqjn95i6e3">
               <w:r>
                 <w:rPr>
-                  <w:rFonts w:ascii="Menlo" w:cs="Menlo" w:eastAsia="Menlo" w:hAnsi="Menlo"/>
+                  <w:rFonts w:ascii="Georgia" w:cs="Georgia" w:eastAsia="Georgia" w:hAnsi="Georgia"/>
                   <w:color w:val="2A2A2A"/>
                   <w:sz w:val="18"/>
                   <w:szCs w:val="18"/>
@@ -107,7 +107,7 @@
             </w:hyperlink>
             <w:r>
               <w:rPr>
-                <w:rFonts w:ascii="Menlo" w:cs="Menlo" w:eastAsia="Menlo" w:hAnsi="Menlo"/>
+                <w:rFonts w:ascii="Georgia" w:cs="Georgia" w:eastAsia="Georgia" w:hAnsi="Georgia"/>
                 <w:color w:val="2A2A2A"/>
                 <w:sz w:val="18"/>
                 <w:szCs w:val="18"/>
@@ -141,7 +141,7 @@
             </w:pPr>
             <w:r>
               <w:rPr>
-                <w:rFonts w:ascii="Menlo" w:cs="Menlo" w:eastAsia="Menlo" w:hAnsi="Menlo"/>
+                <w:rFonts w:ascii="Georgia" w:cs="Georgia" w:eastAsia="Georgia" w:hAnsi="Georgia"/>
                 <w:color w:val="8A8A8A"/>
                 <w:sz w:val="18"/>
                 <w:szCs w:val="18"/>
@@ -173,7 +173,7 @@
             </w:pPr>
             <w:r>
               <w:rPr>
-                <w:rFonts w:ascii="Menlo" w:cs="Menlo" w:eastAsia="Menlo" w:hAnsi="Menlo"/>
+                <w:rFonts w:ascii="Georgia" w:cs="Georgia" w:eastAsia="Georgia" w:hAnsi="Georgia"/>
                 <w:color w:val="2A2A2A"/>
                 <w:sz w:val="18"/>
                 <w:szCs w:val="18"/>
@@ -207,7 +207,7 @@
             </w:pPr>
             <w:r>
               <w:rPr>
-                <w:rFonts w:ascii="Menlo" w:cs="Menlo" w:eastAsia="Menlo" w:hAnsi="Menlo"/>
+                <w:rFonts w:ascii="Georgia" w:cs="Georgia" w:eastAsia="Georgia" w:hAnsi="Georgia"/>
                 <w:color w:val="8A8A8A"/>
                 <w:sz w:val="18"/>
                 <w:szCs w:val="18"/>
@@ -239,7 +239,7 @@
             </w:pPr>
             <w:r>
               <w:rPr>
-                <w:rFonts w:ascii="Menlo" w:cs="Menlo" w:eastAsia="Menlo" w:hAnsi="Menlo"/>
+                <w:rFonts w:ascii="Georgia" w:cs="Georgia" w:eastAsia="Georgia" w:hAnsi="Georgia"/>
                 <w:b/>
                 <w:bCs/>
                 <w:color w:val="000000"/>
@@ -250,7 +250,7 @@
             </w:r>
             <w:r>
               <w:rPr>
-                <w:rFonts w:ascii="Menlo" w:cs="Menlo" w:eastAsia="Menlo" w:hAnsi="Menlo"/>
+                <w:rFonts w:ascii="Georgia" w:cs="Georgia" w:eastAsia="Georgia" w:hAnsi="Georgia"/>
                 <w:color w:val="8A8A8A"/>
                 <w:sz w:val="18"/>
                 <w:szCs w:val="18"/>
@@ -264,7 +264,7 @@
             </w:pPr>
             <w:r>
               <w:rPr>
-                <w:rFonts w:ascii="Menlo" w:cs="Menlo" w:eastAsia="Menlo" w:hAnsi="Menlo"/>
+                <w:rFonts w:ascii="Georgia" w:cs="Georgia" w:eastAsia="Georgia" w:hAnsi="Georgia"/>
                 <w:color w:val="2A2A2A"/>
                 <w:sz w:val="18"/>
                 <w:szCs w:val="18"/>
@@ -278,7 +278,7 @@
             </w:pPr>
             <w:r>
               <w:rPr>
-                <w:rFonts w:ascii="Menlo" w:cs="Menlo" w:eastAsia="Menlo" w:hAnsi="Menlo"/>
+                <w:rFonts w:ascii="Georgia" w:cs="Georgia" w:eastAsia="Georgia" w:hAnsi="Georgia"/>
                 <w:color w:val="8A8A8A"/>
                 <w:sz w:val="16"/>
                 <w:szCs w:val="16"/>
@@ -292,7 +292,7 @@
             </w:pPr>
             <w:r>
               <w:rPr>
-                <w:rFonts w:ascii="Menlo" w:cs="Menlo" w:eastAsia="Menlo" w:hAnsi="Menlo"/>
+                <w:rFonts w:ascii="Georgia" w:cs="Georgia" w:eastAsia="Georgia" w:hAnsi="Georgia"/>
                 <w:b/>
                 <w:bCs/>
                 <w:color w:val="000000"/>
@@ -303,7 +303,7 @@
             </w:r>
             <w:r>
               <w:rPr>
-                <w:rFonts w:ascii="Menlo" w:cs="Menlo" w:eastAsia="Menlo" w:hAnsi="Menlo"/>
+                <w:rFonts w:ascii="Georgia" w:cs="Georgia" w:eastAsia="Georgia" w:hAnsi="Georgia"/>
                 <w:color w:val="8A8A8A"/>
                 <w:sz w:val="18"/>
                 <w:szCs w:val="18"/>
@@ -317,7 +317,7 @@
             </w:pPr>
             <w:r>
               <w:rPr>
-                <w:rFonts w:ascii="Menlo" w:cs="Menlo" w:eastAsia="Menlo" w:hAnsi="Menlo"/>
+                <w:rFonts w:ascii="Georgia" w:cs="Georgia" w:eastAsia="Georgia" w:hAnsi="Georgia"/>
                 <w:color w:val="2A2A2A"/>
                 <w:sz w:val="18"/>
                 <w:szCs w:val="18"/>
@@ -331,7 +331,7 @@
             </w:pPr>
             <w:r>
               <w:rPr>
-                <w:rFonts w:ascii="Menlo" w:cs="Menlo" w:eastAsia="Menlo" w:hAnsi="Menlo"/>
+                <w:rFonts w:ascii="Georgia" w:cs="Georgia" w:eastAsia="Georgia" w:hAnsi="Georgia"/>
                 <w:color w:val="8A8A8A"/>
                 <w:sz w:val="16"/>
                 <w:szCs w:val="16"/>
@@ -345,7 +345,7 @@
             </w:pPr>
             <w:r>
               <w:rPr>
-                <w:rFonts w:ascii="Menlo" w:cs="Menlo" w:eastAsia="Menlo" w:hAnsi="Menlo"/>
+                <w:rFonts w:ascii="Georgia" w:cs="Georgia" w:eastAsia="Georgia" w:hAnsi="Georgia"/>
                 <w:b/>
                 <w:bCs/>
                 <w:color w:val="000000"/>
@@ -356,7 +356,7 @@
             </w:r>
             <w:r>
               <w:rPr>
-                <w:rFonts w:ascii="Menlo" w:cs="Menlo" w:eastAsia="Menlo" w:hAnsi="Menlo"/>
+                <w:rFonts w:ascii="Georgia" w:cs="Georgia" w:eastAsia="Georgia" w:hAnsi="Georgia"/>
                 <w:color w:val="8A8A8A"/>
                 <w:sz w:val="18"/>
                 <w:szCs w:val="18"/>
@@ -370,7 +370,7 @@
             </w:pPr>
             <w:r>
               <w:rPr>
-                <w:rFonts w:ascii="Menlo" w:cs="Menlo" w:eastAsia="Menlo" w:hAnsi="Menlo"/>
+                <w:rFonts w:ascii="Georgia" w:cs="Georgia" w:eastAsia="Georgia" w:hAnsi="Georgia"/>
                 <w:color w:val="2A2A2A"/>
                 <w:sz w:val="18"/>
                 <w:szCs w:val="18"/>
@@ -384,7 +384,7 @@
             </w:pPr>
             <w:r>
               <w:rPr>
-                <w:rFonts w:ascii="Menlo" w:cs="Menlo" w:eastAsia="Menlo" w:hAnsi="Menlo"/>
+                <w:rFonts w:ascii="Georgia" w:cs="Georgia" w:eastAsia="Georgia" w:hAnsi="Georgia"/>
                 <w:color w:val="8A8A8A"/>
                 <w:sz w:val="16"/>
                 <w:szCs w:val="16"/>
@@ -398,7 +398,7 @@
             </w:pPr>
             <w:r>
               <w:rPr>
-                <w:rFonts w:ascii="Menlo" w:cs="Menlo" w:eastAsia="Menlo" w:hAnsi="Menlo"/>
+                <w:rFonts w:ascii="Georgia" w:cs="Georgia" w:eastAsia="Georgia" w:hAnsi="Georgia"/>
                 <w:b/>
                 <w:bCs/>
                 <w:color w:val="000000"/>
@@ -409,7 +409,7 @@
             </w:r>
             <w:r>
               <w:rPr>
-                <w:rFonts w:ascii="Menlo" w:cs="Menlo" w:eastAsia="Menlo" w:hAnsi="Menlo"/>
+                <w:rFonts w:ascii="Georgia" w:cs="Georgia" w:eastAsia="Georgia" w:hAnsi="Georgia"/>
                 <w:color w:val="8A8A8A"/>
                 <w:sz w:val="18"/>
                 <w:szCs w:val="18"/>
@@ -423,7 +423,7 @@
             </w:pPr>
             <w:r>
               <w:rPr>
-                <w:rFonts w:ascii="Menlo" w:cs="Menlo" w:eastAsia="Menlo" w:hAnsi="Menlo"/>
+                <w:rFonts w:ascii="Georgia" w:cs="Georgia" w:eastAsia="Georgia" w:hAnsi="Georgia"/>
                 <w:color w:val="2A2A2A"/>
                 <w:sz w:val="18"/>
                 <w:szCs w:val="18"/>
@@ -437,7 +437,7 @@
             </w:pPr>
             <w:r>
               <w:rPr>
-                <w:rFonts w:ascii="Menlo" w:cs="Menlo" w:eastAsia="Menlo" w:hAnsi="Menlo"/>
+                <w:rFonts w:ascii="Georgia" w:cs="Georgia" w:eastAsia="Georgia" w:hAnsi="Georgia"/>
                 <w:color w:val="8A8A8A"/>
                 <w:sz w:val="16"/>
                 <w:szCs w:val="16"/>
@@ -471,7 +471,7 @@
             </w:pPr>
             <w:r>
               <w:rPr>
-                <w:rFonts w:ascii="Menlo" w:cs="Menlo" w:eastAsia="Menlo" w:hAnsi="Menlo"/>
+                <w:rFonts w:ascii="Georgia" w:cs="Georgia" w:eastAsia="Georgia" w:hAnsi="Georgia"/>
                 <w:color w:val="8A8A8A"/>
                 <w:sz w:val="18"/>
                 <w:szCs w:val="18"/>
@@ -503,7 +503,7 @@
             </w:pPr>
             <w:r>
               <w:rPr>
-                <w:rFonts w:ascii="Menlo" w:cs="Menlo" w:eastAsia="Menlo" w:hAnsi="Menlo"/>
+                <w:rFonts w:ascii="Georgia" w:cs="Georgia" w:eastAsia="Georgia" w:hAnsi="Georgia"/>
                 <w:b/>
                 <w:bCs/>
                 <w:color w:val="000000"/>
@@ -514,7 +514,7 @@
             </w:r>
             <w:r>
               <w:rPr>
-                <w:rFonts w:ascii="Menlo" w:cs="Menlo" w:eastAsia="Menlo" w:hAnsi="Menlo"/>
+                <w:rFonts w:ascii="Georgia" w:cs="Georgia" w:eastAsia="Georgia" w:hAnsi="Georgia"/>
                 <w:color w:val="8A8A8A"/>
                 <w:sz w:val="18"/>
                 <w:szCs w:val="18"/>
@@ -528,7 +528,7 @@
             </w:pPr>
             <w:r>
               <w:rPr>
-                <w:rFonts w:ascii="Menlo" w:cs="Menlo" w:eastAsia="Menlo" w:hAnsi="Menlo"/>
+                <w:rFonts w:ascii="Georgia" w:cs="Georgia" w:eastAsia="Georgia" w:hAnsi="Georgia"/>
                 <w:color w:val="2A2A2A"/>
                 <w:sz w:val="18"/>
                 <w:szCs w:val="18"/>
@@ -542,7 +542,7 @@
             </w:pPr>
             <w:r>
               <w:rPr>
-                <w:rFonts w:ascii="Menlo" w:cs="Menlo" w:eastAsia="Menlo" w:hAnsi="Menlo"/>
+                <w:rFonts w:ascii="Georgia" w:cs="Georgia" w:eastAsia="Georgia" w:hAnsi="Georgia"/>
                 <w:color w:val="8A8A8A"/>
                 <w:sz w:val="16"/>
                 <w:szCs w:val="16"/>
@@ -556,7 +556,7 @@
             </w:pPr>
             <w:r>
               <w:rPr>
-                <w:rFonts w:ascii="Menlo" w:cs="Menlo" w:eastAsia="Menlo" w:hAnsi="Menlo"/>
+                <w:rFonts w:ascii="Georgia" w:cs="Georgia" w:eastAsia="Georgia" w:hAnsi="Georgia"/>
                 <w:b/>
                 <w:bCs/>
                 <w:color w:val="000000"/>
@@ -567,7 +567,7 @@
             </w:r>
             <w:r>
               <w:rPr>
-                <w:rFonts w:ascii="Menlo" w:cs="Menlo" w:eastAsia="Menlo" w:hAnsi="Menlo"/>
+                <w:rFonts w:ascii="Georgia" w:cs="Georgia" w:eastAsia="Georgia" w:hAnsi="Georgia"/>
                 <w:color w:val="8A8A8A"/>
                 <w:sz w:val="18"/>
                 <w:szCs w:val="18"/>
@@ -581,7 +581,7 @@
             </w:pPr>
             <w:r>
               <w:rPr>
-                <w:rFonts w:ascii="Menlo" w:cs="Menlo" w:eastAsia="Menlo" w:hAnsi="Menlo"/>
+                <w:rFonts w:ascii="Georgia" w:cs="Georgia" w:eastAsia="Georgia" w:hAnsi="Georgia"/>
                 <w:color w:val="2A2A2A"/>
                 <w:sz w:val="18"/>
                 <w:szCs w:val="18"/>
@@ -595,7 +595,7 @@
             </w:pPr>
             <w:r>
               <w:rPr>
-                <w:rFonts w:ascii="Menlo" w:cs="Menlo" w:eastAsia="Menlo" w:hAnsi="Menlo"/>
+                <w:rFonts w:ascii="Georgia" w:cs="Georgia" w:eastAsia="Georgia" w:hAnsi="Georgia"/>
                 <w:color w:val="8A8A8A"/>
                 <w:sz w:val="16"/>
                 <w:szCs w:val="16"/>
@@ -609,7 +609,7 @@
             </w:pPr>
             <w:r>
               <w:rPr>
-                <w:rFonts w:ascii="Menlo" w:cs="Menlo" w:eastAsia="Menlo" w:hAnsi="Menlo"/>
+                <w:rFonts w:ascii="Georgia" w:cs="Georgia" w:eastAsia="Georgia" w:hAnsi="Georgia"/>
                 <w:b/>
                 <w:bCs/>
                 <w:color w:val="000000"/>
@@ -620,7 +620,7 @@
             </w:r>
             <w:r>
               <w:rPr>
-                <w:rFonts w:ascii="Menlo" w:cs="Menlo" w:eastAsia="Menlo" w:hAnsi="Menlo"/>
+                <w:rFonts w:ascii="Georgia" w:cs="Georgia" w:eastAsia="Georgia" w:hAnsi="Georgia"/>
                 <w:color w:val="8A8A8A"/>
                 <w:sz w:val="18"/>
                 <w:szCs w:val="18"/>
@@ -634,7 +634,7 @@
             </w:pPr>
             <w:r>
               <w:rPr>
-                <w:rFonts w:ascii="Menlo" w:cs="Menlo" w:eastAsia="Menlo" w:hAnsi="Menlo"/>
+                <w:rFonts w:ascii="Georgia" w:cs="Georgia" w:eastAsia="Georgia" w:hAnsi="Georgia"/>
                 <w:color w:val="2A2A2A"/>
                 <w:sz w:val="18"/>
                 <w:szCs w:val="18"/>
@@ -648,7 +648,7 @@
             </w:pPr>
             <w:r>
               <w:rPr>
-                <w:rFonts w:ascii="Menlo" w:cs="Menlo" w:eastAsia="Menlo" w:hAnsi="Menlo"/>
+                <w:rFonts w:ascii="Georgia" w:cs="Georgia" w:eastAsia="Georgia" w:hAnsi="Georgia"/>
                 <w:color w:val="8A8A8A"/>
                 <w:sz w:val="16"/>
                 <w:szCs w:val="16"/>
@@ -682,7 +682,7 @@
             </w:pPr>
             <w:r>
               <w:rPr>
-                <w:rFonts w:ascii="Menlo" w:cs="Menlo" w:eastAsia="Menlo" w:hAnsi="Menlo"/>
+                <w:rFonts w:ascii="Georgia" w:cs="Georgia" w:eastAsia="Georgia" w:hAnsi="Georgia"/>
                 <w:color w:val="8A8A8A"/>
                 <w:sz w:val="18"/>
                 <w:szCs w:val="18"/>
@@ -714,7 +714,7 @@
             </w:pPr>
             <w:r>
               <w:rPr>
-                <w:rFonts w:ascii="Menlo" w:cs="Menlo" w:eastAsia="Menlo" w:hAnsi="Menlo"/>
+                <w:rFonts w:ascii="Georgia" w:cs="Georgia" w:eastAsia="Georgia" w:hAnsi="Georgia"/>
                 <w:b/>
                 <w:bCs/>
                 <w:color w:val="000000"/>
@@ -725,7 +725,7 @@
             </w:r>
             <w:r>
               <w:rPr>
-                <w:rFonts w:ascii="Menlo" w:cs="Menlo" w:eastAsia="Menlo" w:hAnsi="Menlo"/>
+                <w:rFonts w:ascii="Georgia" w:cs="Georgia" w:eastAsia="Georgia" w:hAnsi="Georgia"/>
                 <w:color w:val="8A8A8A"/>
                 <w:sz w:val="18"/>
                 <w:szCs w:val="18"/>
@@ -734,7 +734,7 @@
             </w:r>
             <w:r>
               <w:rPr>
-                <w:rFonts w:ascii="Menlo" w:cs="Menlo" w:eastAsia="Menlo" w:hAnsi="Menlo"/>
+                <w:rFonts w:ascii="Georgia" w:cs="Georgia" w:eastAsia="Georgia" w:hAnsi="Georgia"/>
                 <w:color w:val="8A8A8A"/>
                 <w:sz w:val="16"/>
                 <w:szCs w:val="16"/>
@@ -748,7 +748,7 @@
             </w:pPr>
             <w:r>
               <w:rPr>
-                <w:rFonts w:ascii="Menlo" w:cs="Menlo" w:eastAsia="Menlo" w:hAnsi="Menlo"/>
+                <w:rFonts w:ascii="Georgia" w:cs="Georgia" w:eastAsia="Georgia" w:hAnsi="Georgia"/>
                 <w:b/>
                 <w:bCs/>
                 <w:color w:val="000000"/>
@@ -759,7 +759,7 @@
             </w:r>
             <w:r>
               <w:rPr>
-                <w:rFonts w:ascii="Menlo" w:cs="Menlo" w:eastAsia="Menlo" w:hAnsi="Menlo"/>
+                <w:rFonts w:ascii="Georgia" w:cs="Georgia" w:eastAsia="Georgia" w:hAnsi="Georgia"/>
                 <w:color w:val="8A8A8A"/>
                 <w:sz w:val="18"/>
                 <w:szCs w:val="18"/>
@@ -768,7 +768,7 @@
             </w:r>
             <w:r>
               <w:rPr>
-                <w:rFonts w:ascii="Menlo" w:cs="Menlo" w:eastAsia="Menlo" w:hAnsi="Menlo"/>
+                <w:rFonts w:ascii="Georgia" w:cs="Georgia" w:eastAsia="Georgia" w:hAnsi="Georgia"/>
                 <w:color w:val="8A8A8A"/>
                 <w:sz w:val="16"/>
                 <w:szCs w:val="16"/>
@@ -802,7 +802,7 @@
             </w:pPr>
             <w:r>
               <w:rPr>
-                <w:rFonts w:ascii="Menlo" w:cs="Menlo" w:eastAsia="Menlo" w:hAnsi="Menlo"/>
+                <w:rFonts w:ascii="Georgia" w:cs="Georgia" w:eastAsia="Georgia" w:hAnsi="Georgia"/>
                 <w:color w:val="8A8A8A"/>
                 <w:sz w:val="18"/>
                 <w:szCs w:val="18"/>
@@ -834,7 +834,7 @@
             </w:pPr>
             <w:r>
               <w:rPr>
-                <w:rFonts w:ascii="Menlo" w:cs="Menlo" w:eastAsia="Menlo" w:hAnsi="Menlo"/>
+                <w:rFonts w:ascii="Georgia" w:cs="Georgia" w:eastAsia="Georgia" w:hAnsi="Georgia"/>
                 <w:b/>
                 <w:bCs/>
                 <w:color w:val="000000"/>
@@ -845,7 +845,7 @@
             </w:r>
             <w:r>
               <w:rPr>
-                <w:rFonts w:ascii="Menlo" w:cs="Menlo" w:eastAsia="Menlo" w:hAnsi="Menlo"/>
+                <w:rFonts w:ascii="Georgia" w:cs="Georgia" w:eastAsia="Georgia" w:hAnsi="Georgia"/>
                 <w:color w:val="2A2A2A"/>
                 <w:sz w:val="18"/>
                 <w:szCs w:val="18"/>
@@ -859,7 +859,7 @@
             </w:pPr>
             <w:r>
               <w:rPr>
-                <w:rFonts w:ascii="Menlo" w:cs="Menlo" w:eastAsia="Menlo" w:hAnsi="Menlo"/>
+                <w:rFonts w:ascii="Georgia" w:cs="Georgia" w:eastAsia="Georgia" w:hAnsi="Georgia"/>
                 <w:b/>
                 <w:bCs/>
                 <w:color w:val="000000"/>
@@ -870,7 +870,7 @@
             </w:r>
             <w:r>
               <w:rPr>
-                <w:rFonts w:ascii="Menlo" w:cs="Menlo" w:eastAsia="Menlo" w:hAnsi="Menlo"/>
+                <w:rFonts w:ascii="Georgia" w:cs="Georgia" w:eastAsia="Georgia" w:hAnsi="Georgia"/>
                 <w:color w:val="2A2A2A"/>
                 <w:sz w:val="18"/>
                 <w:szCs w:val="18"/>

</xml_diff>